<commit_message>
Fixed layout information in Architecture document and misinformation in the associated code.
</commit_message>
<xml_diff>
--- a/Documentation/Developer/ARCHITECTURE.docx
+++ b/Documentation/Developer/ARCHITECTURE.docx
@@ -26,8 +26,8 @@
         </w:rPr>
       </w:r>
       <w:r>
-        <w:pict w14:anchorId="0EF2AC2E">
-          <v:rect id="Horizontal Line 1" o:spid="_x0000_s1035" style="width:468pt;height:1.1pt;visibility:visible;mso-wrap-style:square;mso-left-percent:-10001;mso-top-percent:-10001;mso-position-horizontal:absolute;mso-position-horizontal-relative:char;mso-position-vertical:absolute;mso-position-vertical-relative:line;mso-left-percent:-10001;mso-top-percent:-10001;v-text-anchor:top" o:gfxdata="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" filled="f">
+        <w:pict w14:anchorId="01B31131">
+          <v:rect id="Horizontal Line 1" o:spid="_x0000_s1035" style="width:10in;height:1.1pt;visibility:visible;mso-wrap-style:square;mso-left-percent:-10001;mso-top-percent:-10001;mso-position-horizontal:absolute;mso-position-horizontal-relative:char;mso-position-vertical:absolute;mso-position-vertical-relative:line;mso-left-percent:-10001;mso-top-percent:-10001;v-text-anchor:top" o:gfxdata="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" filled="f">
             <o:lock v:ext="edit" rotation="t" aspectratio="t" verticies="t" text="t" shapetype="t"/>
             <w10:anchorlock/>
           </v:rect>
@@ -258,8 +258,8 @@
         </w:rPr>
       </w:r>
       <w:r>
-        <w:pict w14:anchorId="615CC640">
-          <v:rect id="Horizontal Line 2" o:spid="_x0000_s1034" style="width:468pt;height:1.1pt;visibility:visible;mso-wrap-style:square;mso-left-percent:-10001;mso-top-percent:-10001;mso-position-horizontal:absolute;mso-position-horizontal-relative:char;mso-position-vertical:absolute;mso-position-vertical-relative:line;mso-left-percent:-10001;mso-top-percent:-10001;v-text-anchor:top" o:gfxdata="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" filled="f">
+        <w:pict w14:anchorId="62BDD263">
+          <v:rect id="Horizontal Line 2" o:spid="_x0000_s1034" style="width:10in;height:1.1pt;visibility:visible;mso-wrap-style:square;mso-left-percent:-10001;mso-top-percent:-10001;mso-position-horizontal:absolute;mso-position-horizontal-relative:char;mso-position-vertical:absolute;mso-position-vertical-relative:line;mso-left-percent:-10001;mso-top-percent:-10001;v-text-anchor:top" o:gfxdata="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" filled="f">
             <o:lock v:ext="edit" rotation="t" aspectratio="t" verticies="t" text="t" shapetype="t"/>
             <w10:anchorlock/>
           </v:rect>
@@ -368,6 +368,7 @@
           <w:b/>
           <w:bCs/>
         </w:rPr>
+        <w:lastRenderedPageBreak/>
         <w:t>Publishes:</w:t>
       </w:r>
     </w:p>
@@ -379,9 +380,9 @@
         <w:tblLook w:val="0020" w:firstRow="1" w:lastRow="0" w:firstColumn="0" w:lastColumn="0" w:noHBand="0" w:noVBand="0"/>
       </w:tblPr>
       <w:tblGrid>
-        <w:gridCol w:w="3120"/>
-        <w:gridCol w:w="3120"/>
-        <w:gridCol w:w="3120"/>
+        <w:gridCol w:w="4872"/>
+        <w:gridCol w:w="4872"/>
+        <w:gridCol w:w="4872"/>
       </w:tblGrid>
       <w:tr>
         <w:trPr>
@@ -397,7 +398,6 @@
               <w:pStyle w:val="Compact"/>
             </w:pPr>
             <w:r>
-              <w:lastRenderedPageBreak/>
               <w:t>Property</w:t>
             </w:r>
           </w:p>
@@ -682,8 +682,8 @@
         </w:rPr>
       </w:r>
       <w:r>
-        <w:pict w14:anchorId="72D05E57">
-          <v:rect id="Horizontal Line 3" o:spid="_x0000_s1033" style="width:468pt;height:1.1pt;visibility:visible;mso-wrap-style:square;mso-left-percent:-10001;mso-top-percent:-10001;mso-position-horizontal:absolute;mso-position-horizontal-relative:char;mso-position-vertical:absolute;mso-position-vertical-relative:line;mso-left-percent:-10001;mso-top-percent:-10001;v-text-anchor:top" o:gfxdata="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" filled="f">
+        <w:pict w14:anchorId="1E777B30">
+          <v:rect id="Horizontal Line 3" o:spid="_x0000_s1033" style="width:10in;height:1.1pt;visibility:visible;mso-wrap-style:square;mso-left-percent:-10001;mso-top-percent:-10001;mso-position-horizontal:absolute;mso-position-horizontal-relative:char;mso-position-vertical:absolute;mso-position-vertical-relative:line;mso-left-percent:-10001;mso-top-percent:-10001;v-text-anchor:top" o:gfxdata="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" filled="f">
             <o:lock v:ext="edit" rotation="t" aspectratio="t" verticies="t" text="t" shapetype="t"/>
             <w10:anchorlock/>
           </v:rect>
@@ -749,8 +749,8 @@
         <w:tblLook w:val="0020" w:firstRow="1" w:lastRow="0" w:firstColumn="0" w:lastColumn="0" w:noHBand="0" w:noVBand="0"/>
       </w:tblPr>
       <w:tblGrid>
-        <w:gridCol w:w="4680"/>
-        <w:gridCol w:w="4680"/>
+        <w:gridCol w:w="7308"/>
+        <w:gridCol w:w="7308"/>
       </w:tblGrid>
       <w:tr>
         <w:trPr>
@@ -917,21 +917,24 @@
               <w:rPr>
                 <w:rStyle w:val="VerbatimChar"/>
               </w:rPr>
+              <w:t>+DecayTracking</w:t>
+            </w:r>
+          </w:p>
+        </w:tc>
+        <w:tc>
+          <w:tcPr>
+            <w:tcW w:w="3960" w:type="dxa"/>
+          </w:tcPr>
+          <w:p>
+            <w:pPr>
+              <w:pStyle w:val="Compact"/>
+            </w:pPr>
+            <w:r>
+              <w:t xml:space="preserve">Opens a 3-second ring-out window after each tap. Measures time </w:t>
+            </w:r>
+            <w:r>
               <w:lastRenderedPageBreak/>
-              <w:t>+DecayTracking</w:t>
-            </w:r>
-          </w:p>
-        </w:tc>
-        <w:tc>
-          <w:tcPr>
-            <w:tcW w:w="3960" w:type="dxa"/>
-          </w:tcPr>
-          <w:p>
-            <w:pPr>
-              <w:pStyle w:val="Compact"/>
-            </w:pPr>
-            <w:r>
-              <w:t>Opens a 3-second ring-out window after each tap. Measures time from peak level to a threshold crossing (</w:t>
+              <w:t>from peak level to a threshold crossing (</w:t>
             </w:r>
             <w:r>
               <w:rPr>
@@ -958,6 +961,7 @@
               <w:rPr>
                 <w:rStyle w:val="VerbatimChar"/>
               </w:rPr>
+              <w:lastRenderedPageBreak/>
               <w:t>+MeasurementManagement</w:t>
             </w:r>
           </w:p>
@@ -1211,8 +1215,8 @@
         <w:tblLook w:val="0020" w:firstRow="1" w:lastRow="0" w:firstColumn="0" w:lastColumn="0" w:noHBand="0" w:noVBand="0"/>
       </w:tblPr>
       <w:tblGrid>
-        <w:gridCol w:w="4680"/>
-        <w:gridCol w:w="4680"/>
+        <w:gridCol w:w="7308"/>
+        <w:gridCol w:w="7308"/>
       </w:tblGrid>
       <w:tr>
         <w:trPr>
@@ -1504,8 +1508,8 @@
         </w:rPr>
       </w:r>
       <w:r>
-        <w:pict w14:anchorId="144E6DED">
-          <v:rect id="Horizontal Line 4" o:spid="_x0000_s1032" style="width:468pt;height:1.1pt;visibility:visible;mso-wrap-style:square;mso-left-percent:-10001;mso-top-percent:-10001;mso-position-horizontal:absolute;mso-position-horizontal-relative:char;mso-position-vertical:absolute;mso-position-vertical-relative:line;mso-left-percent:-10001;mso-top-percent:-10001;v-text-anchor:top" o:gfxdata="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" filled="f">
+        <w:pict w14:anchorId="668C9821">
+          <v:rect id="Horizontal Line 4" o:spid="_x0000_s1032" style="width:10in;height:1.1pt;visibility:visible;mso-wrap-style:square;mso-left-percent:-10001;mso-top-percent:-10001;mso-position-horizontal:absolute;mso-position-horizontal-relative:char;mso-position-vertical:absolute;mso-position-vertical-relative:line;mso-left-percent:-10001;mso-top-percent:-10001;v-text-anchor:top" o:gfxdata="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" filled="f">
             <o:lock v:ext="edit" rotation="t" aspectratio="t" verticies="t" text="t" shapetype="t"/>
             <w10:anchorlock/>
           </v:rect>
@@ -1546,11 +1550,7 @@
         <w:t>spectrumSnapshot</w:t>
       </w:r>
       <w:r>
-        <w:t xml:space="preserve">; plate/brace </w:t>
-      </w:r>
-      <w:r>
-        <w:lastRenderedPageBreak/>
-        <w:t xml:space="preserve">add </w:t>
+        <w:t xml:space="preserve">; plate/brace add </w:t>
       </w:r>
       <w:r>
         <w:rPr>
@@ -1587,6 +1587,7 @@
       <w:bookmarkStart w:id="7" w:name="spectrumsnapshot"/>
       <w:bookmarkEnd w:id="6"/>
       <w:r>
+        <w:lastRenderedPageBreak/>
         <w:t>SpectrumSnapshot</w:t>
       </w:r>
     </w:p>
@@ -1918,8 +1919,8 @@
         </w:rPr>
       </w:r>
       <w:r>
-        <w:pict w14:anchorId="0CE18ABD">
-          <v:rect id="Horizontal Line 5" o:spid="_x0000_s1031" style="width:468pt;height:1.1pt;visibility:visible;mso-wrap-style:square;mso-left-percent:-10001;mso-top-percent:-10001;mso-position-horizontal:absolute;mso-position-horizontal-relative:char;mso-position-vertical:absolute;mso-position-vertical-relative:line;mso-left-percent:-10001;mso-top-percent:-10001;v-text-anchor:top" o:gfxdata="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" filled="f">
+        <w:pict w14:anchorId="76E0DD16">
+          <v:rect id="Horizontal Line 5" o:spid="_x0000_s1031" style="width:10in;height:1.1pt;visibility:visible;mso-wrap-style:square;mso-left-percent:-10001;mso-top-percent:-10001;mso-position-horizontal:absolute;mso-position-horizontal-relative:char;mso-position-vertical:absolute;mso-position-vertical-relative:line;mso-left-percent:-10001;mso-top-percent:-10001;v-text-anchor:top" o:gfxdata="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" filled="f">
             <o:lock v:ext="edit" rotation="t" aspectratio="t" verticies="t" text="t" shapetype="t"/>
             <w10:anchorlock/>
           </v:rect>
@@ -2063,7 +2064,6 @@
           <w:b/>
           <w:bCs/>
         </w:rPr>
-        <w:lastRenderedPageBreak/>
         <w:t>AVAudioDevice</w:t>
       </w:r>
       <w:r>
@@ -2088,6 +2088,7 @@
           <w:b/>
           <w:bCs/>
         </w:rPr>
+        <w:lastRenderedPageBreak/>
         <w:t>TapDisplaySettings</w:t>
       </w:r>
       <w:r>
@@ -2101,8 +2102,8 @@
         </w:rPr>
       </w:r>
       <w:r>
-        <w:pict w14:anchorId="4B781192">
-          <v:rect id="Horizontal Line 6" o:spid="_x0000_s1030" style="width:468pt;height:1.1pt;visibility:visible;mso-wrap-style:square;mso-left-percent:-10001;mso-top-percent:-10001;mso-position-horizontal:absolute;mso-position-horizontal-relative:char;mso-position-vertical:absolute;mso-position-vertical-relative:line;mso-left-percent:-10001;mso-top-percent:-10001;v-text-anchor:top" o:gfxdata="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" filled="f">
+        <w:pict w14:anchorId="5C30DC7D">
+          <v:rect id="Horizontal Line 6" o:spid="_x0000_s1030" style="width:10in;height:1.1pt;visibility:visible;mso-wrap-style:square;mso-left-percent:-10001;mso-top-percent:-10001;mso-position-horizontal:absolute;mso-position-horizontal-relative:char;mso-position-vertical:absolute;mso-position-vertical-relative:line;mso-left-percent:-10001;mso-top-percent:-10001;v-text-anchor:top" o:gfxdata="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" filled="f">
             <o:lock v:ext="edit" rotation="t" aspectratio="t" verticies="t" text="t" shapetype="t"/>
             <w10:anchorlock/>
           </v:rect>
@@ -2278,8 +2279,8 @@
         </w:rPr>
       </w:r>
       <w:r>
-        <w:pict w14:anchorId="61A0521C">
-          <v:rect id="Horizontal Line 7" o:spid="_x0000_s1029" style="width:468pt;height:1.1pt;visibility:visible;mso-wrap-style:square;mso-left-percent:-10001;mso-top-percent:-10001;mso-position-horizontal:absolute;mso-position-horizontal-relative:char;mso-position-vertical:absolute;mso-position-vertical-relative:line;mso-left-percent:-10001;mso-top-percent:-10001;v-text-anchor:top" o:gfxdata="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" filled="f">
+        <w:pict w14:anchorId="0F6B68E4">
+          <v:rect id="Horizontal Line 7" o:spid="_x0000_s1029" style="width:10in;height:1.1pt;visibility:visible;mso-wrap-style:square;mso-left-percent:-10001;mso-top-percent:-10001;mso-position-horizontal:absolute;mso-position-horizontal-relative:char;mso-position-vertical:absolute;mso-position-vertical-relative:line;mso-left-percent:-10001;mso-top-percent:-10001;v-text-anchor:top" o:gfxdata="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" filled="f">
             <o:lock v:ext="edit" rotation="t" aspectratio="t" verticies="t" text="t" shapetype="t"/>
             <w10:anchorlock/>
           </v:rect>
@@ -2327,8 +2328,8 @@
         <w:tblLook w:val="0020" w:firstRow="1" w:lastRow="0" w:firstColumn="0" w:lastColumn="0" w:noHBand="0" w:noVBand="0"/>
       </w:tblPr>
       <w:tblGrid>
-        <w:gridCol w:w="4680"/>
-        <w:gridCol w:w="4680"/>
+        <w:gridCol w:w="7308"/>
+        <w:gridCol w:w="7308"/>
       </w:tblGrid>
       <w:tr>
         <w:trPr>
@@ -2385,13 +2386,16 @@
               <w:pStyle w:val="Compact"/>
             </w:pPr>
             <w:r>
+              <w:t>Vertical stack (</w:t>
+            </w:r>
+            <w:r>
               <w:rPr>
                 <w:rStyle w:val="VerbatimChar"/>
               </w:rPr>
-              <w:t>HSplitView</w:t>
-            </w:r>
-            <w:r>
-              <w:t xml:space="preserve">: spectrum on left, collapsible right panel. Results open in a free-floating </w:t>
+              <w:t>standardVerticalLayout</w:t>
+            </w:r>
+            <w:r>
+              <w:t xml:space="preserve">). Results open in a free-floating </w:t>
             </w:r>
             <w:r>
               <w:rPr>
@@ -2409,7 +2413,7 @@
               <w:t>ResultsWindowPresenter</w:t>
             </w:r>
             <w:r>
-              <w:t>.</w:t>
+              <w:t>. All other panels (save, settings, measurements, metrics) present as sheets.</w:t>
             </w:r>
           </w:p>
         </w:tc>
@@ -2437,7 +2441,25 @@
               <w:pStyle w:val="Compact"/>
             </w:pPr>
             <w:r>
-              <w:t>Vertical stack. Results/metrics panel appears as an inline side panel.</w:t>
+              <w:t>Vertical stack (</w:t>
+            </w:r>
+            <w:r>
+              <w:rPr>
+                <w:rStyle w:val="VerbatimChar"/>
+              </w:rPr>
+              <w:t>standardVerticalLayout</w:t>
+            </w:r>
+            <w:r>
+              <w:t xml:space="preserve">) inside a </w:t>
+            </w:r>
+            <w:r>
+              <w:rPr>
+                <w:rStyle w:val="VerbatimChar"/>
+              </w:rPr>
+              <w:t>NavigationView</w:t>
+            </w:r>
+            <w:r>
+              <w:t>. All secondary panels present as sheets.</w:t>
             </w:r>
           </w:p>
         </w:tc>
@@ -2452,7 +2474,6 @@
               <w:pStyle w:val="Compact"/>
             </w:pPr>
             <w:r>
-              <w:lastRenderedPageBreak/>
               <w:t>iOS iPhone (portrait)</w:t>
             </w:r>
           </w:p>
@@ -2466,7 +2487,16 @@
               <w:pStyle w:val="Compact"/>
             </w:pPr>
             <w:r>
-              <w:t>Vertical stack. All secondary panels presented as sheets.</w:t>
+              <w:t>Vertical stack (</w:t>
+            </w:r>
+            <w:r>
+              <w:rPr>
+                <w:rStyle w:val="VerbatimChar"/>
+              </w:rPr>
+              <w:t>standardVerticalLayout</w:t>
+            </w:r>
+            <w:r>
+              <w:t>). All secondary panels presented as sheets.</w:t>
             </w:r>
           </w:p>
         </w:tc>
@@ -2500,7 +2530,16 @@
               <w:t>HStack</w:t>
             </w:r>
             <w:r>
-              <w:t>: controls panel on left, spectrum on right.</w:t>
+              <w:t xml:space="preserve"> (</w:t>
+            </w:r>
+            <w:r>
+              <w:rPr>
+                <w:rStyle w:val="VerbatimChar"/>
+              </w:rPr>
+              <w:t>phoneLandscapeLayout</w:t>
+            </w:r>
+            <w:r>
+              <w:t>): 200 pt scrollable controls panel on left, spectrum on right.</w:t>
             </w:r>
           </w:p>
         </w:tc>
@@ -2513,6 +2552,7 @@
       <w:bookmarkStart w:id="15" w:name="view-tree"/>
       <w:bookmarkEnd w:id="14"/>
       <w:r>
+        <w:lastRenderedPageBreak/>
         <w:t>View tree</w:t>
       </w:r>
     </w:p>
@@ -2665,8 +2705,8 @@
         </w:rPr>
       </w:r>
       <w:r>
-        <w:pict w14:anchorId="54D1DAB7">
-          <v:rect id="Horizontal Line 8" o:spid="_x0000_s1028" style="width:468pt;height:1.1pt;visibility:visible;mso-wrap-style:square;mso-left-percent:-10001;mso-top-percent:-10001;mso-position-horizontal:absolute;mso-position-horizontal-relative:char;mso-position-vertical:absolute;mso-position-vertical-relative:line;mso-left-percent:-10001;mso-top-percent:-10001;v-text-anchor:top" o:gfxdata="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" filled="f">
+        <w:pict w14:anchorId="75A33B00">
+          <v:rect id="Horizontal Line 8" o:spid="_x0000_s1028" style="width:10in;height:1.1pt;visibility:visible;mso-wrap-style:square;mso-left-percent:-10001;mso-top-percent:-10001;mso-position-horizontal:absolute;mso-position-horizontal-relative:char;mso-position-vertical:absolute;mso-position-vertical-relative:line;mso-left-percent:-10001;mso-top-percent:-10001;v-text-anchor:top" o:gfxdata="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" filled="f">
             <o:lock v:ext="edit" rotation="t" aspectratio="t" verticies="t" text="t" shapetype="t"/>
             <w10:anchorlock/>
           </v:rect>
@@ -2692,9 +2732,9 @@
         <w:tblLook w:val="0020" w:firstRow="1" w:lastRow="0" w:firstColumn="0" w:lastColumn="0" w:noHBand="0" w:noVBand="0"/>
       </w:tblPr>
       <w:tblGrid>
-        <w:gridCol w:w="3120"/>
-        <w:gridCol w:w="3120"/>
-        <w:gridCol w:w="3120"/>
+        <w:gridCol w:w="4872"/>
+        <w:gridCol w:w="4872"/>
+        <w:gridCol w:w="4872"/>
       </w:tblGrid>
       <w:tr>
         <w:trPr>
@@ -2995,8 +3035,8 @@
         </w:rPr>
       </w:r>
       <w:r>
-        <w:pict w14:anchorId="2F70328C">
-          <v:rect id="Horizontal Line 9" o:spid="_x0000_s1027" style="width:468pt;height:1.1pt;visibility:visible;mso-wrap-style:square;mso-left-percent:-10001;mso-top-percent:-10001;mso-position-horizontal:absolute;mso-position-horizontal-relative:char;mso-position-vertical:absolute;mso-position-vertical-relative:line;mso-left-percent:-10001;mso-top-percent:-10001;v-text-anchor:top" o:gfxdata="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" filled="f">
+        <w:pict w14:anchorId="6E2CF6A0">
+          <v:rect id="Horizontal Line 9" o:spid="_x0000_s1027" style="width:10in;height:1.1pt;visibility:visible;mso-wrap-style:square;mso-left-percent:-10001;mso-top-percent:-10001;mso-position-horizontal:absolute;mso-position-horizontal-relative:char;mso-position-vertical:absolute;mso-position-vertical-relative:line;mso-left-percent:-10001;mso-top-percent:-10001;v-text-anchor:top" o:gfxdata="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" filled="f">
             <o:lock v:ext="edit" rotation="t" aspectratio="t" verticies="t" text="t" shapetype="t"/>
             <w10:anchorlock/>
           </v:rect>
@@ -3010,54 +3050,54 @@
       <w:bookmarkStart w:id="17" w:name="file-map"/>
       <w:bookmarkEnd w:id="16"/>
       <w:r>
+        <w:t>File Map</w:t>
+      </w:r>
+    </w:p>
+    <w:p>
+      <w:pPr>
+        <w:pStyle w:val="SourceCode"/>
+      </w:pPr>
+      <w:r>
+        <w:rPr>
+          <w:rStyle w:val="VerbatimChar"/>
+        </w:rPr>
+        <w:t>GuitarTap/</w:t>
+      </w:r>
+      <w:r>
+        <w:br/>
+      </w:r>
+      <w:r>
+        <w:rPr>
+          <w:rStyle w:val="VerbatimChar"/>
+        </w:rPr>
+        <w:t>├── GuitarTapApp.swift</w:t>
+      </w:r>
+      <w:r>
+        <w:br/>
+      </w:r>
+      <w:r>
+        <w:rPr>
+          <w:rStyle w:val="VerbatimChar"/>
+        </w:rPr>
+        <w:t>├── Models/</w:t>
+      </w:r>
+      <w:r>
+        <w:br/>
+      </w:r>
+      <w:r>
+        <w:rPr>
+          <w:rStyle w:val="VerbatimChar"/>
+        </w:rPr>
+        <w:t>│   ├── RealtimeFFTAnalyzer.swift</w:t>
+      </w:r>
+      <w:r>
+        <w:br/>
+      </w:r>
+      <w:r>
+        <w:rPr>
+          <w:rStyle w:val="VerbatimChar"/>
+        </w:rPr>
         <w:lastRenderedPageBreak/>
-        <w:t>File Map</w:t>
-      </w:r>
-    </w:p>
-    <w:p>
-      <w:pPr>
-        <w:pStyle w:val="SourceCode"/>
-      </w:pPr>
-      <w:r>
-        <w:rPr>
-          <w:rStyle w:val="VerbatimChar"/>
-        </w:rPr>
-        <w:t>GuitarTap/</w:t>
-      </w:r>
-      <w:r>
-        <w:br/>
-      </w:r>
-      <w:r>
-        <w:rPr>
-          <w:rStyle w:val="VerbatimChar"/>
-        </w:rPr>
-        <w:t>├── GuitarTapApp.swift</w:t>
-      </w:r>
-      <w:r>
-        <w:br/>
-      </w:r>
-      <w:r>
-        <w:rPr>
-          <w:rStyle w:val="VerbatimChar"/>
-        </w:rPr>
-        <w:t>├── Models/</w:t>
-      </w:r>
-      <w:r>
-        <w:br/>
-      </w:r>
-      <w:r>
-        <w:rPr>
-          <w:rStyle w:val="VerbatimChar"/>
-        </w:rPr>
-        <w:t>│   ├── RealtimeFFTAnalyzer.swift</w:t>
-      </w:r>
-      <w:r>
-        <w:br/>
-      </w:r>
-      <w:r>
-        <w:rPr>
-          <w:rStyle w:val="VerbatimChar"/>
-        </w:rPr>
         <w:t>│   ├── RealtimeFFTAnalyzer+DeviceManagement.swift</w:t>
       </w:r>
       <w:r>
@@ -3427,6 +3467,7 @@
         <w:rPr>
           <w:rStyle w:val="VerbatimChar"/>
         </w:rPr>
+        <w:lastRenderedPageBreak/>
         <w:t xml:space="preserve">    ├── Measurements/</w:t>
       </w:r>
       <w:r>
@@ -3454,7 +3495,6 @@
         <w:rPr>
           <w:rStyle w:val="VerbatimChar"/>
         </w:rPr>
-        <w:lastRenderedPageBreak/>
         <w:t xml:space="preserve">    │   ├── MeasurementRowView.swift</w:t>
       </w:r>
       <w:r>
@@ -3627,8 +3667,8 @@
         </w:rPr>
       </w:r>
       <w:r>
-        <w:pict w14:anchorId="21CF9D86">
-          <v:rect id="Horizontal Line 10" o:spid="_x0000_s1026" style="width:468pt;height:1.1pt;visibility:visible;mso-wrap-style:square;mso-left-percent:-10001;mso-top-percent:-10001;mso-position-horizontal:absolute;mso-position-horizontal-relative:char;mso-position-vertical:absolute;mso-position-vertical-relative:line;mso-left-percent:-10001;mso-top-percent:-10001;v-text-anchor:top" o:gfxdata="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" filled="f">
+        <w:pict w14:anchorId="3C4EBBF4">
+          <v:rect id="Horizontal Line 10" o:spid="_x0000_s1026" style="width:10in;height:1.1pt;visibility:visible;mso-wrap-style:square;mso-left-percent:-10001;mso-top-percent:-10001;mso-position-horizontal:absolute;mso-position-horizontal-relative:char;mso-position-vertical:absolute;mso-position-vertical-relative:line;mso-left-percent:-10001;mso-top-percent:-10001;v-text-anchor:top" o:gfxdata="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" filled="f">
             <o:lock v:ext="edit" rotation="t" aspectratio="t" verticies="t" text="t" shapetype="t"/>
             <w10:anchorlock/>
           </v:rect>
@@ -3653,9 +3693,10 @@
       <w:footnotePr>
         <w:numRestart w:val="eachSect"/>
       </w:footnotePr>
-      <w:pgSz w:w="12240" w:h="15840"/>
-      <w:pgMar w:top="1440" w:right="1440" w:bottom="1440" w:left="1440" w:header="720" w:footer="720" w:gutter="0"/>
+      <w:pgSz w:w="15840" w:h="12240" w:orient="landscape"/>
+      <w:pgMar w:top="720" w:right="720" w:bottom="720" w:left="720" w:header="720" w:footer="720" w:gutter="0"/>
       <w:cols w:space="720"/>
+      <w:docGrid w:linePitch="326"/>
     </w:sectPr>
   </w:body>
 </w:document>
@@ -3666,7 +3707,7 @@
   <w:abstractNum w:abstractNumId="0" w15:restartNumberingAfterBreak="0">
     <w:nsid w:val="0000A990"/>
     <w:multiLevelType w:val="multilevel"/>
-    <w:tmpl w:val="2E9681D0"/>
+    <w:tmpl w:val="567C423E"/>
     <w:lvl w:ilvl="0">
       <w:numFmt w:val="bullet"/>
       <w:lvlText w:val=" "/>
@@ -3740,7 +3781,7 @@
       </w:pPr>
     </w:lvl>
   </w:abstractNum>
-  <w:num w:numId="1" w16cid:durableId="1385640882">
+  <w:num w:numId="1" w16cid:durableId="369109650">
     <w:abstractNumId w:val="0"/>
   </w:num>
 </w:numbering>

</xml_diff>